<commit_message>
Perbarui dokumentasi: menu TK & SD dan halaman yang disembunyikan
- Bagian 6.2 baru: menu navigasi TK dan SD sesuai tampilan pemilik situs,
  alasan penyesuaian (commit 200df92), dan status halaman Berita, Video,
  Galeri TK & SD yang dipertahankan tetapi tidak tampil di menu.
- Commit acuan di sampul diperbarui ke 200df92; bukti visual formulir PPDB
  TK diambil ulang dengan menu baru; catatan uji ulang ditambahkan.

Co-Authored-By: Claude Opus 5.5 <noreply@anthropic.com>
Claude-Session: https://claude.ai/code/session_015wyFvq16fjcffjyEQZhKKH
</commit_message>
<xml_diff>
--- a/docs/Dokumentasi_Teknis_Website_Yayasan_CBIM.docx
+++ b/docs/Dokumentasi_Teknis_Website_Yayasan_CBIM.docx
@@ -437,7 +437,7 @@
                 <w:sz w:val="20"/>
                 <w:szCs w:val="20"/>
               </w:rPr>
-              <w:t xml:space="preserve">85ebf65 — kode setelah pembersihan dan perbaikan</w:t>
+              <w:t xml:space="preserve">200df92 — kode akhir (pembersihan, perbaikan, menu TK/SD)</w:t>
             </w:r>
           </w:p>
         </w:tc>
@@ -7755,7 +7755,7 @@
                 <w:sz w:val="20"/>
                 <w:szCs w:val="20"/>
               </w:rPr>
-              <w:t xml:space="preserve">Ya (formulir BARU, lihat 6.3)</w:t>
+              <w:t xml:space="preserve">Ya (formulir BARU, lihat 6.4)</w:t>
             </w:r>
           </w:p>
         </w:tc>
@@ -7829,7 +7829,7 @@
                 <w:sz w:val="20"/>
                 <w:szCs w:val="20"/>
               </w:rPr>
-              <w:t xml:space="preserve">daftar + detail</w:t>
+              <w:t xml:space="preserve">daftar + detail (tidak di menu)</w:t>
             </w:r>
           </w:p>
         </w:tc>
@@ -7852,7 +7852,7 @@
                 <w:sz w:val="20"/>
                 <w:szCs w:val="20"/>
               </w:rPr>
-              <w:t xml:space="preserve">daftar + detail</w:t>
+              <w:t xml:space="preserve">daftar + detail (tidak di menu)</w:t>
             </w:r>
           </w:p>
         </w:tc>
@@ -7903,7 +7903,7 @@
                 <w:sz w:val="20"/>
                 <w:szCs w:val="20"/>
               </w:rPr>
-              <w:t xml:space="preserve">Ya</w:t>
+              <w:t xml:space="preserve">Ya (tidak di menu)</w:t>
             </w:r>
           </w:p>
         </w:tc>
@@ -7926,7 +7926,7 @@
                 <w:sz w:val="20"/>
                 <w:szCs w:val="20"/>
               </w:rPr>
-              <w:t xml:space="preserve">Ya</w:t>
+              <w:t xml:space="preserve">Ya (tidak di menu)</w:t>
             </w:r>
           </w:p>
         </w:tc>
@@ -8068,7 +8068,7 @@
                 <w:sz w:val="20"/>
                 <w:szCs w:val="20"/>
               </w:rPr>
-              <w:t xml:space="preserve">Kedua method memuat view tk/kegiatan.php dan tk/fasilitas.php yang tidak pernah ada, sehingga galat 500 ("Unable to load the requested file") — padahal keduanya tercantum di sitemap.xml. Menu TK sendiri memakai "Program" dan "Galeri" untuk isi yang sama, jadi URL lama kini dialihkan permanen ke sana dan sitemap diperbarui.</w:t>
+              <w:t xml:space="preserve">Kedua method memuat view tk/kegiatan.php dan tk/fasilitas.php yang tidak pernah ada, sehingga galat 500 ("Unable to load the requested file") — padahal keduanya tercantum di sitemap.xml. Isi yang setara sudah ada di halaman Program dan Galeri TK, jadi URL lama kini dialihkan permanen ke sana dan sitemap diperbarui.</w:t>
             </w:r>
           </w:p>
         </w:tc>
@@ -8093,7 +8093,359 @@
           <w:sz w:val="26"/>
           <w:szCs w:val="26"/>
         </w:rPr>
-        <w:t xml:space="preserve">6.2 Meta Data per Halaman (subsite_meta)</w:t>
+        <w:t xml:space="preserve">6.2 Menu Navigasi</w:t>
+      </w:r>
+    </w:p>
+    <w:tbl>
+      <w:tblPr>
+        <w:tblW w:type="dxa" w:w="9350"/>
+        <w:tblBorders>
+          <w:top w:val="single" w:color="E2DCCF" w:sz="4"/>
+          <w:left w:val="single" w:color="E2DCCF" w:sz="4"/>
+          <w:bottom w:val="single" w:color="E2DCCF" w:sz="4"/>
+          <w:right w:val="single" w:color="E2DCCF" w:sz="4"/>
+          <w:insideH w:val="single" w:color="E2DCCF" w:sz="4"/>
+          <w:insideV w:val="single" w:color="E2DCCF" w:sz="4"/>
+        </w:tblBorders>
+      </w:tblPr>
+      <w:tblGrid>
+        <w:gridCol w:w="1800"/>
+        <w:gridCol w:w="4550"/>
+        <w:gridCol w:w="3000"/>
+      </w:tblGrid>
+      <w:tr>
+        <w:trPr>
+          <w:tblHeader/>
+        </w:trPr>
+        <w:tc>
+          <w:tcPr>
+            <w:tcW w:type="dxa" w:w="1800"/>
+            <w:shd w:fill="16233F" w:color="auto" w:val="clear"/>
+            <w:tcMar>
+              <w:top w:type="dxa" w:w="90"/>
+              <w:left w:type="dxa" w:w="120"/>
+              <w:bottom w:type="dxa" w:w="90"/>
+              <w:right w:type="dxa" w:w="120"/>
+            </w:tcMar>
+            <w:vAlign w:val="center"/>
+          </w:tcPr>
+          <w:p>
+            <w:r>
+              <w:rPr>
+                <w:rFonts w:ascii="Calibri" w:cs="Calibri" w:eastAsia="Calibri" w:hAnsi="Calibri"/>
+                <w:b/>
+                <w:bCs/>
+                <w:color w:val="FFFFFF"/>
+                <w:sz w:val="21"/>
+                <w:szCs w:val="21"/>
+              </w:rPr>
+              <w:t xml:space="preserve">Sub-situs</w:t>
+            </w:r>
+          </w:p>
+        </w:tc>
+        <w:tc>
+          <w:tcPr>
+            <w:tcW w:type="dxa" w:w="4550"/>
+            <w:shd w:fill="16233F" w:color="auto" w:val="clear"/>
+            <w:tcMar>
+              <w:top w:type="dxa" w:w="90"/>
+              <w:left w:type="dxa" w:w="120"/>
+              <w:bottom w:type="dxa" w:w="90"/>
+              <w:right w:type="dxa" w:w="120"/>
+            </w:tcMar>
+            <w:vAlign w:val="center"/>
+          </w:tcPr>
+          <w:p>
+            <w:r>
+              <w:rPr>
+                <w:rFonts w:ascii="Calibri" w:cs="Calibri" w:eastAsia="Calibri" w:hAnsi="Calibri"/>
+                <w:b/>
+                <w:bCs/>
+                <w:color w:val="FFFFFF"/>
+                <w:sz w:val="21"/>
+                <w:szCs w:val="21"/>
+              </w:rPr>
+              <w:t xml:space="preserve">Menu</w:t>
+            </w:r>
+          </w:p>
+        </w:tc>
+        <w:tc>
+          <w:tcPr>
+            <w:tcW w:type="dxa" w:w="3000"/>
+            <w:shd w:fill="16233F" w:color="auto" w:val="clear"/>
+            <w:tcMar>
+              <w:top w:type="dxa" w:w="90"/>
+              <w:left w:type="dxa" w:w="120"/>
+              <w:bottom w:type="dxa" w:w="90"/>
+              <w:right w:type="dxa" w:w="120"/>
+            </w:tcMar>
+            <w:vAlign w:val="center"/>
+          </w:tcPr>
+          <w:p>
+            <w:r>
+              <w:rPr>
+                <w:rFonts w:ascii="Calibri" w:cs="Calibri" w:eastAsia="Calibri" w:hAnsi="Calibri"/>
+                <w:b/>
+                <w:bCs/>
+                <w:color w:val="FFFFFF"/>
+                <w:sz w:val="21"/>
+                <w:szCs w:val="21"/>
+              </w:rPr>
+              <w:t xml:space="preserve">Tombol kanan</w:t>
+            </w:r>
+          </w:p>
+        </w:tc>
+      </w:tr>
+      <w:tr>
+        <w:trPr>
+          <w:cantSplit/>
+        </w:trPr>
+        <w:tc>
+          <w:tcPr>
+            <w:tcW w:type="dxa" w:w="1800"/>
+            <w:shd w:fill="FFFFFF" w:color="auto" w:val="clear"/>
+            <w:tcMar>
+              <w:top w:type="dxa" w:w="90"/>
+              <w:left w:type="dxa" w:w="120"/>
+              <w:bottom w:type="dxa" w:w="90"/>
+              <w:right w:type="dxa" w:w="120"/>
+            </w:tcMar>
+            <w:vAlign w:val="center"/>
+          </w:tcPr>
+          <w:p>
+            <w:r>
+              <w:rPr>
+                <w:rFonts w:ascii="Calibri" w:cs="Calibri" w:eastAsia="Calibri" w:hAnsi="Calibri"/>
+                <w:sz w:val="20"/>
+                <w:szCs w:val="20"/>
+              </w:rPr>
+              <w:t xml:space="preserve">TK (/tk)</w:t>
+            </w:r>
+          </w:p>
+        </w:tc>
+        <w:tc>
+          <w:tcPr>
+            <w:tcW w:type="dxa" w:w="4550"/>
+            <w:shd w:fill="FFFFFF" w:color="auto" w:val="clear"/>
+            <w:tcMar>
+              <w:top w:type="dxa" w:w="90"/>
+              <w:left w:type="dxa" w:w="120"/>
+              <w:bottom w:type="dxa" w:w="90"/>
+              <w:right w:type="dxa" w:w="120"/>
+            </w:tcMar>
+            <w:vAlign w:val="center"/>
+          </w:tcPr>
+          <w:p>
+            <w:r>
+              <w:rPr>
+                <w:rFonts w:ascii="Calibri" w:cs="Calibri" w:eastAsia="Calibri" w:hAnsi="Calibri"/>
+                <w:sz w:val="20"/>
+                <w:szCs w:val="20"/>
+              </w:rPr>
+              <w:t xml:space="preserve">Beranda, Profil, Program, Pendaftaran</w:t>
+            </w:r>
+          </w:p>
+        </w:tc>
+        <w:tc>
+          <w:tcPr>
+            <w:tcW w:type="dxa" w:w="3000"/>
+            <w:shd w:fill="FFFFFF" w:color="auto" w:val="clear"/>
+            <w:tcMar>
+              <w:top w:type="dxa" w:w="90"/>
+              <w:left w:type="dxa" w:w="120"/>
+              <w:bottom w:type="dxa" w:w="90"/>
+              <w:right w:type="dxa" w:w="120"/>
+            </w:tcMar>
+            <w:vAlign w:val="center"/>
+          </w:tcPr>
+          <w:p>
+            <w:r>
+              <w:rPr>
+                <w:rFonts w:ascii="Calibri" w:cs="Calibri" w:eastAsia="Calibri" w:hAnsi="Calibri"/>
+                <w:sz w:val="20"/>
+                <w:szCs w:val="20"/>
+              </w:rPr>
+              <w:t xml:space="preserve">Login Admin, Yayasan</w:t>
+            </w:r>
+          </w:p>
+        </w:tc>
+      </w:tr>
+      <w:tr>
+        <w:trPr>
+          <w:cantSplit/>
+        </w:trPr>
+        <w:tc>
+          <w:tcPr>
+            <w:tcW w:type="dxa" w:w="1800"/>
+            <w:shd w:fill="F7F5F0" w:color="auto" w:val="clear"/>
+            <w:tcMar>
+              <w:top w:type="dxa" w:w="90"/>
+              <w:left w:type="dxa" w:w="120"/>
+              <w:bottom w:type="dxa" w:w="90"/>
+              <w:right w:type="dxa" w:w="120"/>
+            </w:tcMar>
+            <w:vAlign w:val="center"/>
+          </w:tcPr>
+          <w:p>
+            <w:r>
+              <w:rPr>
+                <w:rFonts w:ascii="Calibri" w:cs="Calibri" w:eastAsia="Calibri" w:hAnsi="Calibri"/>
+                <w:sz w:val="20"/>
+                <w:szCs w:val="20"/>
+              </w:rPr>
+              <w:t xml:space="preserve">SD (/sd)</w:t>
+            </w:r>
+          </w:p>
+        </w:tc>
+        <w:tc>
+          <w:tcPr>
+            <w:tcW w:type="dxa" w:w="4550"/>
+            <w:shd w:fill="F7F5F0" w:color="auto" w:val="clear"/>
+            <w:tcMar>
+              <w:top w:type="dxa" w:w="90"/>
+              <w:left w:type="dxa" w:w="120"/>
+              <w:bottom w:type="dxa" w:w="90"/>
+              <w:right w:type="dxa" w:w="120"/>
+            </w:tcMar>
+            <w:vAlign w:val="center"/>
+          </w:tcPr>
+          <w:p>
+            <w:r>
+              <w:rPr>
+                <w:rFonts w:ascii="Calibri" w:cs="Calibri" w:eastAsia="Calibri" w:hAnsi="Calibri"/>
+                <w:sz w:val="20"/>
+                <w:szCs w:val="20"/>
+              </w:rPr>
+              <w:t xml:space="preserve">Beranda, Profil, Fasilitas, Kegiatan, Pendaftaran</w:t>
+            </w:r>
+          </w:p>
+        </w:tc>
+        <w:tc>
+          <w:tcPr>
+            <w:tcW w:type="dxa" w:w="3000"/>
+            <w:shd w:fill="F7F5F0" w:color="auto" w:val="clear"/>
+            <w:tcMar>
+              <w:top w:type="dxa" w:w="90"/>
+              <w:left w:type="dxa" w:w="120"/>
+              <w:bottom w:type="dxa" w:w="90"/>
+              <w:right w:type="dxa" w:w="120"/>
+            </w:tcMar>
+            <w:vAlign w:val="center"/>
+          </w:tcPr>
+          <w:p>
+            <w:r>
+              <w:rPr>
+                <w:rFonts w:ascii="Calibri" w:cs="Calibri" w:eastAsia="Calibri" w:hAnsi="Calibri"/>
+                <w:sz w:val="20"/>
+                <w:szCs w:val="20"/>
+              </w:rPr>
+              <w:t xml:space="preserve">Login Admin, Yayasan</w:t>
+            </w:r>
+          </w:p>
+        </w:tc>
+      </w:tr>
+    </w:tbl>
+    <w:p>
+      <w:pPr>
+        <w:spacing w:after="0" w:before="0" w:line="200"/>
+      </w:pPr>
+    </w:p>
+    <w:tbl>
+      <w:tblPr>
+        <w:tblW w:type="dxa" w:w="9350"/>
+        <w:tblBorders>
+          <w:top w:val="single" w:color="E6EEF7" w:sz="4"/>
+          <w:left w:val="single" w:color="1F5C99" w:sz="24"/>
+          <w:bottom w:val="single" w:color="E6EEF7" w:sz="4"/>
+          <w:right w:val="single" w:color="E6EEF7" w:sz="4"/>
+          <w:insideH w:val="single" w:color="auto" w:sz="4"/>
+          <w:insideV w:val="single" w:color="auto" w:sz="4"/>
+        </w:tblBorders>
+      </w:tblPr>
+      <w:tblGrid>
+        <w:gridCol w:w="9350"/>
+      </w:tblGrid>
+      <w:tr>
+        <w:trPr>
+          <w:cantSplit/>
+        </w:trPr>
+        <w:tc>
+          <w:tcPr>
+            <w:tcW w:type="dxa" w:w="9350"/>
+            <w:shd w:fill="E6EEF7" w:color="auto" w:val="clear"/>
+            <w:tcMar>
+              <w:top w:type="dxa" w:w="90"/>
+              <w:left w:type="dxa" w:w="120"/>
+              <w:bottom w:type="dxa" w:w="90"/>
+              <w:right w:type="dxa" w:w="120"/>
+            </w:tcMar>
+            <w:vAlign w:val="center"/>
+          </w:tcPr>
+          <w:p>
+            <w:pPr>
+              <w:spacing w:after="80"/>
+            </w:pPr>
+            <w:r>
+              <w:rPr>
+                <w:rFonts w:ascii="Calibri" w:cs="Calibri" w:eastAsia="Calibri" w:hAnsi="Calibri"/>
+                <w:b/>
+                <w:bCs/>
+                <w:color w:val="1F242C"/>
+                <w:sz w:val="21"/>
+                <w:szCs w:val="21"/>
+              </w:rPr>
+              <w:t xml:space="preserve">📌  Menu Disamakan dengan Tampilan Pemilik Situs</w:t>
+            </w:r>
+          </w:p>
+          <w:p>
+            <w:pPr>
+              <w:spacing w:after="40" w:line="270"/>
+            </w:pPr>
+            <w:r>
+              <w:rPr>
+                <w:rFonts w:ascii="Calibri" w:cs="Calibri" w:eastAsia="Calibri" w:hAnsi="Calibri"/>
+                <w:sz w:val="20"/>
+                <w:szCs w:val="20"/>
+              </w:rPr>
+              <w:t xml:space="preserve">Commit d52fdf7 menambahkan menu Berita, Video, dan Galeri ke header TK dan SD, sehingga nama sekolah dan tombol "Login Admin" terlipat beberapa baris. Tampilan yang dipakai pemilik situs (dicocokkan dari tangkapan layar versi lokal) tidak memuat ketiga menu itu, dan kombinasi tersebut tidak ada di commit mana pun di GitHub. Header disamakan dengan tangkapan layar (commit 200df92).</w:t>
+            </w:r>
+          </w:p>
+          <w:p>
+            <w:pPr>
+              <w:spacing w:after="40" w:line="270"/>
+            </w:pPr>
+            <w:r>
+              <w:rPr>
+                <w:rFonts w:ascii="Calibri" w:cs="Calibri" w:eastAsia="Calibri" w:hAnsi="Calibri"/>
+                <w:sz w:val="20"/>
+                <w:szCs w:val="20"/>
+              </w:rPr>
+              <w:t xml:space="preserve">Halaman Berita, Video, dan Galeri TK &amp; SD beserta method-nya tetap ada atas keputusan pemilik: tidak tampil di menu, tetapi bisa dibuka lewat URL (mis. /tk/galeri, /sd/berita) dan dapat dimunculkan kembali dengan menambahkan tautannya di templates/tk|sd/header.php.</w:t>
+            </w:r>
+          </w:p>
+        </w:tc>
+      </w:tr>
+    </w:tbl>
+    <w:p>
+      <w:pPr>
+        <w:spacing w:after="0" w:before="0" w:line="200"/>
+      </w:pPr>
+    </w:p>
+    <w:p>
+      <w:pPr>
+        <w:pStyle w:val="Heading2"/>
+        <w:spacing w:after="180" w:before="360"/>
+      </w:pPr>
+      <w:r>
+        <w:rPr>
+          <w:rFonts w:ascii="Calibri" w:cs="Calibri" w:eastAsia="Calibri" w:hAnsi="Calibri"/>
+          <w:b/>
+          <w:bCs/>
+          <w:color w:val="16233F"/>
+          <w:sz w:val="26"/>
+          <w:szCs w:val="26"/>
+        </w:rPr>
+        <w:t xml:space="preserve">6.3 Meta Data per Halaman (subsite_meta)</w:t>
       </w:r>
     </w:p>
     <w:tbl>
@@ -8247,7 +8599,7 @@
           <w:sz w:val="26"/>
           <w:szCs w:val="26"/>
         </w:rPr>
-        <w:t xml:space="preserve">6.3 Formulir PPDB</w:t>
+        <w:t xml:space="preserve">6.4 Formulir PPDB</w:t>
       </w:r>
     </w:p>
     <w:p>
@@ -8521,7 +8873,7 @@
           <w:sz w:val="26"/>
           <w:szCs w:val="26"/>
         </w:rPr>
-        <w:t xml:space="preserve">6.4 Gambar di Halaman SD</w:t>
+        <w:t xml:space="preserve">6.5 Gambar di Halaman SD</w:t>
       </w:r>
     </w:p>
     <w:p>
@@ -16120,6 +16472,24 @@
           <w:sz w:val="22"/>
           <w:szCs w:val="22"/>
         </w:rPr>
+        <w:t xml:space="preserve">Halaman Berita, Video, dan Galeri TK &amp; SD (8 view + method-nya) — tidak lagi di menu, tetapi dipertahankan atas keputusan pemilik (Bagian 6.2).</w:t>
+      </w:r>
+    </w:p>
+    <w:p>
+      <w:pPr>
+        <w:pStyle w:val="ListParagraph"/>
+        <w:numPr>
+          <w:ilvl w:val="0"/>
+          <w:numId w:val="3"/>
+        </w:numPr>
+        <w:spacing w:after="90" w:line="280"/>
+      </w:pPr>
+      <w:r>
+        <w:rPr>
+          <w:rFonts w:ascii="Calibri" w:cs="Calibri" w:eastAsia="Calibri" w:hAnsi="Calibri"/>
+          <w:sz w:val="22"/>
+          <w:szCs w:val="22"/>
+        </w:rPr>
         <w:t xml:space="preserve">uploads/ — konten yang dikelola admin. Database produksi bisa merujuk file yang tidak ada di dump, jadi file di sini tidak dihapus walau sebagian tidak dirujuk dump.</w:t>
       </w:r>
     </w:p>
@@ -18917,7 +19287,7 @@
                 <w:sz w:val="20"/>
                 <w:szCs w:val="20"/>
               </w:rPr>
-              <w:t xml:space="preserve">Crawler pada kode asli dijalankan dengan dump apa adanya (tanpa 6 tabel yang hilang) — keadaan yang didapat siapa pun yang memasang dari repositori asli. Uji formulir kode asli dijalankan SETELAH tabel tambahan dibuat, agar logika formulirnya bisa diuji. Kolom "Setelah tahap 1" identik dengan kode asli: pembersihan tidak merusak apa pun. Kode akhir diuji dari instalasi baru mengikuti Bagian 3.2. Tiga respons yang tersisa pada crawler kode akhir memang benar: dua halaman 404 untuk alamat yang tidak ada, dan 405 untuk GET ke endpoint yang hanya menerima POST.</w:t>
+              <w:t xml:space="preserve">Crawler pada kode asli dijalankan dengan dump apa adanya (tanpa 6 tabel yang hilang) — keadaan yang didapat siapa pun yang memasang dari repositori asli. Uji formulir kode asli dijalankan SETELAH tabel tambahan dibuat, agar logika formulirnya bisa diuji. Kolom "Setelah tahap 1" identik dengan kode asli: pembersihan tidak merusak apa pun. Kode akhir diuji dari instalasi baru mengikuti Bagian 3.2. Tiga respons yang tersisa pada crawler kode akhir memang benar: dua halaman 404 untuk alamat yang tidak ada, dan 405 untuk GET ke endpoint yang hanya menerima POST. Seluruh uji diulang setelah penyesuaian menu TK/SD (commit 200df92) dengan hasil yang sama.</w:t>
             </w:r>
           </w:p>
         </w:tc>
@@ -24905,7 +25275,7 @@
           <w:sz w:val="22"/>
           <w:szCs w:val="22"/>
         </w:rPr>
-        <w:t xml:space="preserve">Halaman PPDB TK: tombol "Login Pendaftar" mengarah ke login admin; alur menyebut "Buat Akun" dan "Unggah Berkas" yang tidak tersedia (Bagian 6.3).</w:t>
+        <w:t xml:space="preserve">Halaman PPDB TK: tombol "Login Pendaftar" mengarah ke login admin; alur menyebut "Buat Akun" dan "Unggah Berkas" yang tidak tersedia (Bagian 6.4).</w:t>
       </w:r>
     </w:p>
     <w:p>
@@ -24924,6 +25294,24 @@
           <w:szCs w:val="22"/>
         </w:rPr>
         <w:t xml:space="preserve">Belum ada menu untuk mengelola akun admin (Bagian 3.6).</w:t>
+      </w:r>
+    </w:p>
+    <w:p>
+      <w:pPr>
+        <w:pStyle w:val="ListParagraph"/>
+        <w:numPr>
+          <w:ilvl w:val="0"/>
+          <w:numId w:val="3"/>
+        </w:numPr>
+        <w:spacing w:after="90" w:line="280"/>
+      </w:pPr>
+      <w:r>
+        <w:rPr>
+          <w:rFonts w:ascii="Calibri" w:cs="Calibri" w:eastAsia="Calibri" w:hAnsi="Calibri"/>
+          <w:sz w:val="22"/>
+          <w:szCs w:val="22"/>
+        </w:rPr>
+        <w:t xml:space="preserve">Halaman Berita, Video, dan Galeri TK &amp; SD berfungsi tetapi tidak ditautkan dari menu (Bagian 6.2).</w:t>
       </w:r>
     </w:p>
     <w:p>
@@ -26111,7 +26499,7 @@
       <w:pPr>
         <w:spacing w:after="100"/>
       </w:pPr>
-      <w:hyperlink w:history="1" r:id="rId25jr1wwwhxn5qmzntubwk">
+      <w:hyperlink w:history="1" r:id="rId-lnn-t6jminfxqdb8zkcc">
         <w:r>
           <w:rPr>
             <w:rStyle w:val="Hyperlink"/>
@@ -26129,7 +26517,7 @@
       <w:pPr>
         <w:spacing w:after="100"/>
       </w:pPr>
-      <w:hyperlink w:history="1" r:id="rIdcuneoajf-cg1sexppc9pk">
+      <w:hyperlink w:history="1" r:id="rIdvscxqcjspvouahbhn5gbu">
         <w:r>
           <w:rPr>
             <w:rStyle w:val="Hyperlink"/>
@@ -26147,7 +26535,7 @@
       <w:pPr>
         <w:spacing w:after="100"/>
       </w:pPr>
-      <w:hyperlink w:history="1" r:id="rIdv9rghwlriqq5uznlk8tgr">
+      <w:hyperlink w:history="1" r:id="rIdv7cxok4giuetbxutyydl9">
         <w:r>
           <w:rPr>
             <w:rStyle w:val="Hyperlink"/>
@@ -26165,7 +26553,7 @@
       <w:pPr>
         <w:spacing w:after="100"/>
       </w:pPr>
-      <w:hyperlink w:history="1" r:id="rId3n4cf-efxypawjhmxbpgd">
+      <w:hyperlink w:history="1" r:id="rIdhsa1rshfoeqctyqktouta">
         <w:r>
           <w:rPr>
             <w:rStyle w:val="Hyperlink"/>
@@ -26183,7 +26571,7 @@
       <w:pPr>
         <w:spacing w:after="100"/>
       </w:pPr>
-      <w:hyperlink w:history="1" r:id="rId0gsxb2b-wnxxnjyv2bvml">
+      <w:hyperlink w:history="1" r:id="rId86-d-9nhm1jqbarjr6tto">
         <w:r>
           <w:rPr>
             <w:rStyle w:val="Hyperlink"/>
@@ -26201,7 +26589,7 @@
       <w:pPr>
         <w:spacing w:after="100"/>
       </w:pPr>
-      <w:hyperlink w:history="1" r:id="rIdbrkbaz3e-1s3ihzb8ibya">
+      <w:hyperlink w:history="1" r:id="rId7q_uc3nfgiutvqtp6betj">
         <w:r>
           <w:rPr>
             <w:rStyle w:val="Hyperlink"/>

</xml_diff>